<commit_message>
Refine report scope note
</commit_message>
<xml_diff>
--- a/reports/PSCo_Hourly_Demand_Analysis_Report.docx
+++ b/reports/PSCo_Hourly_Demand_Analysis_Report.docx
@@ -1843,43 +1843,13 @@
         <w:pStyle w:val="Heading1"/>
       </w:pPr>
       <w:r>
-        <w:t>Limitations</w:t>
+        <w:t>Scope and next step</w:t>
       </w:r>
     </w:p>
     <w:p>
-      <w:pPr>
-        <w:pStyle w:val="ListBullet"/>
-        <w:spacing w:after="60"/>
-      </w:pPr>
+      <w:pPr/>
       <w:r>
-        <w:t>The model is evaluated on one chronological split. Repeated rolling-origin tests would give stronger evidence about performance across different periods and seasons.</w:t>
-      </w:r>
-    </w:p>
-    <w:p>
-      <w:pPr>
-        <w:pStyle w:val="ListBullet"/>
-        <w:spacing w:after="60"/>
-      </w:pPr>
-      <w:r>
-        <w:t>The one-hour evaluation assumes the latest actual demand is available each hour; it does not measure a multi-hour-ahead forecast.</w:t>
-      </w:r>
-    </w:p>
-    <w:p>
-      <w:pPr>
-        <w:pStyle w:val="ListBullet"/>
-        <w:spacing w:after="60"/>
-      </w:pPr>
-      <w:r>
-        <w:t>The model uses demand history and calendar features only. It does not incorporate weather, holidays, generation mix, or operational dispatch data.</w:t>
-      </w:r>
-    </w:p>
-    <w:p>
-      <w:pPr>
-        <w:pStyle w:val="ListBullet"/>
-        <w:spacing w:after="60"/>
-      </w:pPr>
-      <w:r>
-        <w:t>The findings are exploratory and do not establish operational reliability or customer-level usage patterns.</w:t>
+        <w:t>The reported scores reflect one chronological holdout and a rolling one-hour-ahead setup using recent actual demand. Testing additional time periods and incorporating weather data would broaden the analysis.</w:t>
       </w:r>
     </w:p>
     <w:p>

</xml_diff>